<commit_message>
add database readme and db
</commit_message>
<xml_diff>
--- a/EasyVerifyDB/README.docx
+++ b/EasyVerifyDB/README.docx
@@ -4,223 +4,1831 @@
   <w:body>
     <w:p>
       <w:pPr>
-        <w:spacing w:line="240" w:lineRule="auto"/>
+        <w:spacing w:line="360" w:lineRule="auto"/>
+        <w:jc w:val="center"/>
       </w:pPr>
       <w:r>
-        <w:t xml:space="preserve">This is a prototype database for tracking verification events. The system is </w:t>
+        <w:rPr>
+          <w:b/>
+          <w:sz w:val="28"/>
+        </w:rPr>
+        <w:t>Database Schema</w:t>
       </w:r>
       <w:r>
-        <w:t>currently in early development.</w:t>
+        <w:br/>
       </w:r>
     </w:p>
     <w:p>
       <w:pPr>
-        <w:spacing w:line="240" w:lineRule="auto"/>
+        <w:spacing w:line="360" w:lineRule="auto"/>
+      </w:pPr>
+      <w:r>
+        <w:t>The database (`EasyVerify`) consists of three tables.</w:t>
+      </w:r>
+      <w:r>
+        <w:t xml:space="preserve"> PK’s are a tables Primary Key and FK’s are Foreign Keys linking one table to another with a specific column.</w:t>
+      </w:r>
+    </w:p>
+    <w:p>
+      <w:pPr>
+        <w:spacing w:line="360" w:lineRule="auto"/>
+        <w:jc w:val="center"/>
         <w:rPr>
           <w:b/>
+          <w:sz w:val="32"/>
         </w:rPr>
       </w:pPr>
       <w:r>
         <w:rPr>
           <w:b/>
+          <w:sz w:val="32"/>
         </w:rPr>
-        <w:t xml:space="preserve">Database Schema </w:t>
+        <w:t>Users</w:t>
       </w:r>
     </w:p>
     <w:p>
       <w:pPr>
-        <w:spacing w:line="240" w:lineRule="auto"/>
+        <w:spacing w:line="360" w:lineRule="auto"/>
       </w:pPr>
       <w:r>
-        <w:t>The database consists of a single table named Verifications. It uses an Auto-Incrementing ID system so that every record is automati</w:t>
+        <w:t>Stores registered</w:t>
       </w:r>
       <w:r>
-        <w:t>cally assigned a unique number.</w:t>
+        <w:t xml:space="preserve"> EasyVerify’s</w:t>
+      </w:r>
+      <w:r>
+        <w:t xml:space="preserve"> user accounts.</w:t>
+      </w:r>
+      <w:r>
+        <w:t xml:space="preserve"> </w:t>
       </w:r>
     </w:p>
+    <w:tbl>
+      <w:tblPr>
+        <w:tblStyle w:val="TableGrid"/>
+        <w:tblW w:w="0" w:type="auto"/>
+        <w:jc w:val="center"/>
+        <w:tblLook w:val="04A0" w:firstRow="1" w:lastRow="0" w:firstColumn="1" w:lastColumn="0" w:noHBand="0" w:noVBand="1"/>
+      </w:tblPr>
+      <w:tblGrid>
+        <w:gridCol w:w="1430"/>
+        <w:gridCol w:w="1216"/>
+        <w:gridCol w:w="2547"/>
+      </w:tblGrid>
+      <w:tr>
+        <w:trPr>
+          <w:trHeight w:val="395"/>
+          <w:jc w:val="center"/>
+        </w:trPr>
+        <w:tc>
+          <w:tcPr>
+            <w:tcW w:w="476" w:type="dxa"/>
+          </w:tcPr>
+          <w:p>
+            <w:pPr>
+              <w:spacing w:line="360" w:lineRule="auto"/>
+            </w:pPr>
+            <w:r>
+              <w:t>Column</w:t>
+            </w:r>
+          </w:p>
+        </w:tc>
+        <w:tc>
+          <w:tcPr>
+            <w:tcW w:w="286" w:type="dxa"/>
+          </w:tcPr>
+          <w:p>
+            <w:pPr>
+              <w:spacing w:line="360" w:lineRule="auto"/>
+            </w:pPr>
+            <w:r>
+              <w:t>Type</w:t>
+            </w:r>
+          </w:p>
+        </w:tc>
+        <w:tc>
+          <w:tcPr>
+            <w:tcW w:w="2547" w:type="dxa"/>
+          </w:tcPr>
+          <w:p>
+            <w:pPr>
+              <w:spacing w:line="360" w:lineRule="auto"/>
+            </w:pPr>
+            <w:r>
+              <w:t>Description</w:t>
+            </w:r>
+          </w:p>
+        </w:tc>
+      </w:tr>
+      <w:tr>
+        <w:trPr>
+          <w:trHeight w:val="389"/>
+          <w:jc w:val="center"/>
+        </w:trPr>
+        <w:tc>
+          <w:tcPr>
+            <w:tcW w:w="476" w:type="dxa"/>
+          </w:tcPr>
+          <w:p>
+            <w:pPr>
+              <w:spacing w:line="360" w:lineRule="auto"/>
+            </w:pPr>
+            <w:r>
+              <w:t>ID</w:t>
+            </w:r>
+          </w:p>
+        </w:tc>
+        <w:tc>
+          <w:tcPr>
+            <w:tcW w:w="286" w:type="dxa"/>
+          </w:tcPr>
+          <w:p>
+            <w:pPr>
+              <w:spacing w:line="360" w:lineRule="auto"/>
+            </w:pPr>
+            <w:r>
+              <w:t>Int</w:t>
+            </w:r>
+          </w:p>
+        </w:tc>
+        <w:tc>
+          <w:tcPr>
+            <w:tcW w:w="2547" w:type="dxa"/>
+          </w:tcPr>
+          <w:p>
+            <w:pPr>
+              <w:spacing w:line="360" w:lineRule="auto"/>
+            </w:pPr>
+            <w:r>
+              <w:t xml:space="preserve">(PK) </w:t>
+            </w:r>
+            <w:r>
+              <w:t>- Users unique ID Number</w:t>
+            </w:r>
+          </w:p>
+        </w:tc>
+      </w:tr>
+      <w:tr>
+        <w:trPr>
+          <w:trHeight w:val="395"/>
+          <w:jc w:val="center"/>
+        </w:trPr>
+        <w:tc>
+          <w:tcPr>
+            <w:tcW w:w="476" w:type="dxa"/>
+          </w:tcPr>
+          <w:p>
+            <w:pPr>
+              <w:spacing w:line="360" w:lineRule="auto"/>
+            </w:pPr>
+            <w:r>
+              <w:t>UserName</w:t>
+            </w:r>
+          </w:p>
+        </w:tc>
+        <w:tc>
+          <w:tcPr>
+            <w:tcW w:w="286" w:type="dxa"/>
+          </w:tcPr>
+          <w:p>
+            <w:pPr>
+              <w:spacing w:line="360" w:lineRule="auto"/>
+            </w:pPr>
+            <w:r>
+              <w:t>VarChar</w:t>
+            </w:r>
+          </w:p>
+        </w:tc>
+        <w:tc>
+          <w:tcPr>
+            <w:tcW w:w="2547" w:type="dxa"/>
+          </w:tcPr>
+          <w:p>
+            <w:pPr>
+              <w:spacing w:line="360" w:lineRule="auto"/>
+            </w:pPr>
+            <w:r>
+              <w:t>User’s username</w:t>
+            </w:r>
+          </w:p>
+        </w:tc>
+      </w:tr>
+      <w:tr>
+        <w:trPr>
+          <w:trHeight w:val="389"/>
+          <w:jc w:val="center"/>
+        </w:trPr>
+        <w:tc>
+          <w:tcPr>
+            <w:tcW w:w="476" w:type="dxa"/>
+          </w:tcPr>
+          <w:p>
+            <w:pPr>
+              <w:spacing w:line="360" w:lineRule="auto"/>
+            </w:pPr>
+            <w:r>
+              <w:t>Email</w:t>
+            </w:r>
+          </w:p>
+        </w:tc>
+        <w:tc>
+          <w:tcPr>
+            <w:tcW w:w="286" w:type="dxa"/>
+          </w:tcPr>
+          <w:p>
+            <w:pPr>
+              <w:spacing w:line="360" w:lineRule="auto"/>
+            </w:pPr>
+            <w:r>
+              <w:t>VarChar</w:t>
+            </w:r>
+          </w:p>
+        </w:tc>
+        <w:tc>
+          <w:tcPr>
+            <w:tcW w:w="2547" w:type="dxa"/>
+          </w:tcPr>
+          <w:p>
+            <w:pPr>
+              <w:spacing w:line="360" w:lineRule="auto"/>
+            </w:pPr>
+            <w:r>
+              <w:t>Users email (Unique)</w:t>
+            </w:r>
+          </w:p>
+        </w:tc>
+      </w:tr>
+      <w:tr>
+        <w:trPr>
+          <w:trHeight w:val="395"/>
+          <w:jc w:val="center"/>
+        </w:trPr>
+        <w:tc>
+          <w:tcPr>
+            <w:tcW w:w="476" w:type="dxa"/>
+          </w:tcPr>
+          <w:p>
+            <w:pPr>
+              <w:spacing w:line="360" w:lineRule="auto"/>
+            </w:pPr>
+            <w:r>
+              <w:t>pw</w:t>
+            </w:r>
+          </w:p>
+        </w:tc>
+        <w:tc>
+          <w:tcPr>
+            <w:tcW w:w="286" w:type="dxa"/>
+          </w:tcPr>
+          <w:p>
+            <w:pPr>
+              <w:spacing w:line="360" w:lineRule="auto"/>
+            </w:pPr>
+            <w:r>
+              <w:t>Char</w:t>
+            </w:r>
+          </w:p>
+        </w:tc>
+        <w:tc>
+          <w:tcPr>
+            <w:tcW w:w="2547" w:type="dxa"/>
+          </w:tcPr>
+          <w:p>
+            <w:pPr>
+              <w:spacing w:line="360" w:lineRule="auto"/>
+            </w:pPr>
+            <w:r>
+              <w:t>Hashed PW</w:t>
+            </w:r>
+          </w:p>
+        </w:tc>
+      </w:tr>
+      <w:tr>
+        <w:trPr>
+          <w:trHeight w:val="389"/>
+          <w:jc w:val="center"/>
+        </w:trPr>
+        <w:tc>
+          <w:tcPr>
+            <w:tcW w:w="476" w:type="dxa"/>
+          </w:tcPr>
+          <w:p>
+            <w:pPr>
+              <w:spacing w:line="360" w:lineRule="auto"/>
+            </w:pPr>
+            <w:r>
+              <w:t>Created_at</w:t>
+            </w:r>
+          </w:p>
+        </w:tc>
+        <w:tc>
+          <w:tcPr>
+            <w:tcW w:w="286" w:type="dxa"/>
+          </w:tcPr>
+          <w:p>
+            <w:pPr>
+              <w:spacing w:line="360" w:lineRule="auto"/>
+            </w:pPr>
+            <w:r>
+              <w:t>timestamp</w:t>
+            </w:r>
+          </w:p>
+        </w:tc>
+        <w:tc>
+          <w:tcPr>
+            <w:tcW w:w="2547" w:type="dxa"/>
+          </w:tcPr>
+          <w:p>
+            <w:pPr>
+              <w:spacing w:line="360" w:lineRule="auto"/>
+            </w:pPr>
+            <w:r>
+              <w:t>Account creation time</w:t>
+            </w:r>
+          </w:p>
+        </w:tc>
+      </w:tr>
+      <w:tr>
+        <w:trPr>
+          <w:trHeight w:val="890"/>
+          <w:jc w:val="center"/>
+        </w:trPr>
+        <w:tc>
+          <w:tcPr>
+            <w:tcW w:w="476" w:type="dxa"/>
+          </w:tcPr>
+          <w:p>
+            <w:pPr>
+              <w:spacing w:line="360" w:lineRule="auto"/>
+            </w:pPr>
+            <w:r>
+              <w:t>Is_persistent</w:t>
+            </w:r>
+          </w:p>
+        </w:tc>
+        <w:tc>
+          <w:tcPr>
+            <w:tcW w:w="286" w:type="dxa"/>
+          </w:tcPr>
+          <w:p>
+            <w:pPr>
+              <w:spacing w:line="360" w:lineRule="auto"/>
+            </w:pPr>
+            <w:r>
+              <w:t>T</w:t>
+            </w:r>
+            <w:r>
+              <w:t>inyI</w:t>
+            </w:r>
+            <w:r>
+              <w:t>nt</w:t>
+            </w:r>
+          </w:p>
+        </w:tc>
+        <w:tc>
+          <w:tcPr>
+            <w:tcW w:w="2547" w:type="dxa"/>
+          </w:tcPr>
+          <w:p>
+            <w:pPr>
+              <w:spacing w:line="360" w:lineRule="auto"/>
+            </w:pPr>
+            <w:r>
+              <w:t>Boolean whether verification token is persistent</w:t>
+            </w:r>
+          </w:p>
+        </w:tc>
+      </w:tr>
+      <w:tr>
+        <w:trPr>
+          <w:trHeight w:val="395"/>
+          <w:jc w:val="center"/>
+        </w:trPr>
+        <w:tc>
+          <w:tcPr>
+            <w:tcW w:w="476" w:type="dxa"/>
+          </w:tcPr>
+          <w:p>
+            <w:pPr>
+              <w:spacing w:line="360" w:lineRule="auto"/>
+            </w:pPr>
+            <w:r>
+              <w:t>Last_login</w:t>
+            </w:r>
+          </w:p>
+        </w:tc>
+        <w:tc>
+          <w:tcPr>
+            <w:tcW w:w="286" w:type="dxa"/>
+          </w:tcPr>
+          <w:p>
+            <w:pPr>
+              <w:spacing w:line="360" w:lineRule="auto"/>
+            </w:pPr>
+            <w:r>
+              <w:t>timestamp</w:t>
+            </w:r>
+          </w:p>
+        </w:tc>
+        <w:tc>
+          <w:tcPr>
+            <w:tcW w:w="2547" w:type="dxa"/>
+          </w:tcPr>
+          <w:p>
+            <w:pPr>
+              <w:spacing w:line="360" w:lineRule="auto"/>
+            </w:pPr>
+            <w:r>
+              <w:t>Last login</w:t>
+            </w:r>
+          </w:p>
+        </w:tc>
+      </w:tr>
+    </w:tbl>
     <w:p>
       <w:pPr>
-        <w:spacing w:line="240" w:lineRule="auto"/>
-      </w:pPr>
-      <w:r>
-        <w:t>Tracked Variables:</w:t>
-      </w:r>
-    </w:p>
-    <w:p>
-      <w:pPr>
-        <w:spacing w:line="240" w:lineRule="auto"/>
-      </w:pPr>
-      <w:r>
-        <w:t xml:space="preserve">id: (Primary Key) Unique identifier automatically assigned by the database (1, 2, 3...). </w:t>
-      </w:r>
-    </w:p>
-    <w:p>
-      <w:pPr>
-        <w:spacing w:line="240" w:lineRule="auto"/>
-      </w:pPr>
-      <w:r>
-        <w:t xml:space="preserve">Result: Success/Failure status (Integer: 1 for Success, 0 for Failure). </w:t>
-      </w:r>
-    </w:p>
-    <w:p>
-      <w:pPr>
-        <w:spacing w:line="240" w:lineRule="auto"/>
-      </w:pPr>
-      <w:r>
-        <w:t>Method: The verification technique used, such as '</w:t>
-      </w:r>
-      <w:proofErr w:type="spellStart"/>
-      <w:r>
-        <w:t>manual_test</w:t>
-      </w:r>
-      <w:proofErr w:type="spellEnd"/>
-      <w:r>
-        <w:t xml:space="preserve">' (Text). </w:t>
-      </w:r>
-    </w:p>
-    <w:p>
-      <w:pPr>
-        <w:spacing w:line="240" w:lineRule="auto"/>
-      </w:pPr>
-      <w:r>
-        <w:t xml:space="preserve">Policy: The specific rule set or policy applied during verification (Text). </w:t>
-      </w:r>
-    </w:p>
-    <w:p>
-      <w:pPr>
-        <w:spacing w:line="240" w:lineRule="auto"/>
-      </w:pPr>
-      <w:r>
-        <w:t xml:space="preserve">Confidence: The certainty score of the result, typically 0-100 (Integer). </w:t>
-      </w:r>
-    </w:p>
-    <w:p>
-      <w:pPr>
-        <w:spacing w:line="240" w:lineRule="auto"/>
-      </w:pPr>
-      <w:r>
-        <w:t xml:space="preserve">Error_code: Reserved for logging specific error messages or codes (Text). </w:t>
-      </w:r>
-    </w:p>
-    <w:p>
-      <w:pPr>
-        <w:spacing w:line="240" w:lineRule="auto"/>
-      </w:pPr>
-      <w:r>
-        <w:t>Variables Not Saved (Current Version):</w:t>
-      </w:r>
-    </w:p>
-    <w:p>
-      <w:pPr>
-        <w:spacing w:line="240" w:lineRule="auto"/>
-      </w:pPr>
-      <w:r>
-        <w:t xml:space="preserve">raw_age: This field is currently commented out in the schema and not recorded. </w:t>
-      </w:r>
-    </w:p>
-    <w:p>
-      <w:pPr>
-        <w:spacing w:line="240" w:lineRule="auto"/>
-      </w:pPr>
-      <w:r>
-        <w:t xml:space="preserve">Image: </w:t>
-      </w:r>
-      <w:r>
-        <w:t>This field is currently commented out in the schema and not recorded.</w:t>
-      </w:r>
-    </w:p>
-    <w:p>
-      <w:pPr>
-        <w:spacing w:line="240" w:lineRule="auto"/>
-      </w:pPr>
-      <w:r>
-        <w:t xml:space="preserve">ID_Text: </w:t>
-      </w:r>
-      <w:r>
-        <w:t>This field is currently commented out in the schema and not recorded.</w:t>
-      </w:r>
-      <w:r>
-        <w:br/>
-        <w:t xml:space="preserve">Face_Embedding: </w:t>
-      </w:r>
-      <w:r>
-        <w:t>This field is currently commented out in the schema and not recorded.</w:t>
-      </w:r>
-    </w:p>
-    <w:p>
-      <w:pPr>
-        <w:spacing w:line="240" w:lineRule="auto"/>
-      </w:pPr>
-      <w:r>
-        <w:t xml:space="preserve">Time: While the column exists, it is currently left empty in the Python insert script. </w:t>
-      </w:r>
-    </w:p>
-    <w:p>
-      <w:pPr>
-        <w:spacing w:line="240" w:lineRule="auto"/>
+        <w:spacing w:line="360" w:lineRule="auto"/>
       </w:pPr>
     </w:p>
     <w:p>
       <w:pPr>
-        <w:spacing w:line="240" w:lineRule="auto"/>
+        <w:spacing w:line="360" w:lineRule="auto"/>
+        <w:jc w:val="center"/>
         <w:rPr>
           <w:b/>
+          <w:sz w:val="32"/>
         </w:rPr>
       </w:pPr>
       <w:r>
         <w:rPr>
           <w:b/>
+          <w:sz w:val="32"/>
         </w:rPr>
-        <w:t xml:space="preserve">How to Add Data </w:t>
+        <w:t>Verification</w:t>
       </w:r>
     </w:p>
     <w:p>
       <w:pPr>
-        <w:spacing w:line="240" w:lineRule="auto"/>
+        <w:spacing w:line="360" w:lineRule="auto"/>
       </w:pPr>
       <w:r>
-        <w:t>To add a record, open DBManager.py and locate the new_record tuple. Update the value</w:t>
+        <w:t>Stores verification attempts linked to a user.</w:t>
       </w:r>
+    </w:p>
+    <w:tbl>
+      <w:tblPr>
+        <w:tblStyle w:val="TableGrid"/>
+        <w:tblW w:w="0" w:type="auto"/>
+        <w:jc w:val="center"/>
+        <w:tblLook w:val="04A0" w:firstRow="1" w:lastRow="0" w:firstColumn="1" w:lastColumn="0" w:noHBand="0" w:noVBand="1"/>
+      </w:tblPr>
+      <w:tblGrid>
+        <w:gridCol w:w="1525"/>
+        <w:gridCol w:w="1440"/>
+        <w:gridCol w:w="3960"/>
+      </w:tblGrid>
+      <w:tr>
+        <w:trPr>
+          <w:jc w:val="center"/>
+        </w:trPr>
+        <w:tc>
+          <w:tcPr>
+            <w:tcW w:w="1525" w:type="dxa"/>
+          </w:tcPr>
+          <w:p>
+            <w:pPr>
+              <w:spacing w:line="360" w:lineRule="auto"/>
+            </w:pPr>
+            <w:r>
+              <w:t>Column</w:t>
+            </w:r>
+          </w:p>
+        </w:tc>
+        <w:tc>
+          <w:tcPr>
+            <w:tcW w:w="1440" w:type="dxa"/>
+          </w:tcPr>
+          <w:p>
+            <w:pPr>
+              <w:spacing w:line="360" w:lineRule="auto"/>
+            </w:pPr>
+            <w:r>
+              <w:t>Type</w:t>
+            </w:r>
+          </w:p>
+        </w:tc>
+        <w:tc>
+          <w:tcPr>
+            <w:tcW w:w="3960" w:type="dxa"/>
+          </w:tcPr>
+          <w:p>
+            <w:pPr>
+              <w:spacing w:line="360" w:lineRule="auto"/>
+            </w:pPr>
+            <w:r>
+              <w:t>Description</w:t>
+            </w:r>
+          </w:p>
+        </w:tc>
+      </w:tr>
+      <w:tr>
+        <w:trPr>
+          <w:jc w:val="center"/>
+        </w:trPr>
+        <w:tc>
+          <w:tcPr>
+            <w:tcW w:w="1525" w:type="dxa"/>
+          </w:tcPr>
+          <w:p>
+            <w:pPr>
+              <w:spacing w:line="360" w:lineRule="auto"/>
+            </w:pPr>
+            <w:r>
+              <w:t>ID</w:t>
+            </w:r>
+          </w:p>
+        </w:tc>
+        <w:tc>
+          <w:tcPr>
+            <w:tcW w:w="1440" w:type="dxa"/>
+          </w:tcPr>
+          <w:p>
+            <w:pPr>
+              <w:spacing w:line="360" w:lineRule="auto"/>
+            </w:pPr>
+            <w:r>
+              <w:t>Int(11)</w:t>
+            </w:r>
+          </w:p>
+        </w:tc>
+        <w:tc>
+          <w:tcPr>
+            <w:tcW w:w="3960" w:type="dxa"/>
+          </w:tcPr>
+          <w:p>
+            <w:pPr>
+              <w:spacing w:line="360" w:lineRule="auto"/>
+            </w:pPr>
+            <w:r>
+              <w:t>(PK)Unique ID of verification attempt</w:t>
+            </w:r>
+          </w:p>
+        </w:tc>
+      </w:tr>
+      <w:tr>
+        <w:trPr>
+          <w:trHeight w:val="503"/>
+          <w:jc w:val="center"/>
+        </w:trPr>
+        <w:tc>
+          <w:tcPr>
+            <w:tcW w:w="1525" w:type="dxa"/>
+          </w:tcPr>
+          <w:p>
+            <w:pPr>
+              <w:spacing w:line="360" w:lineRule="auto"/>
+            </w:pPr>
+            <w:r>
+              <w:t>User_ID</w:t>
+            </w:r>
+          </w:p>
+        </w:tc>
+        <w:tc>
+          <w:tcPr>
+            <w:tcW w:w="1440" w:type="dxa"/>
+          </w:tcPr>
+          <w:p>
+            <w:pPr>
+              <w:spacing w:line="360" w:lineRule="auto"/>
+            </w:pPr>
+            <w:r>
+              <w:t>Int(11)</w:t>
+            </w:r>
+          </w:p>
+        </w:tc>
+        <w:tc>
+          <w:tcPr>
+            <w:tcW w:w="3960" w:type="dxa"/>
+          </w:tcPr>
+          <w:p>
+            <w:pPr>
+              <w:spacing w:line="360" w:lineRule="auto"/>
+            </w:pPr>
+            <w:r>
+              <w:t>(FK)Links to users.id</w:t>
+            </w:r>
+          </w:p>
+        </w:tc>
+      </w:tr>
+      <w:tr>
+        <w:trPr>
+          <w:jc w:val="center"/>
+        </w:trPr>
+        <w:tc>
+          <w:tcPr>
+            <w:tcW w:w="1525" w:type="dxa"/>
+          </w:tcPr>
+          <w:p>
+            <w:pPr>
+              <w:spacing w:line="360" w:lineRule="auto"/>
+            </w:pPr>
+            <w:r>
+              <w:t>Created_At</w:t>
+            </w:r>
+          </w:p>
+        </w:tc>
+        <w:tc>
+          <w:tcPr>
+            <w:tcW w:w="1440" w:type="dxa"/>
+          </w:tcPr>
+          <w:p>
+            <w:pPr>
+              <w:spacing w:line="360" w:lineRule="auto"/>
+            </w:pPr>
+            <w:r>
+              <w:t>timestamp</w:t>
+            </w:r>
+          </w:p>
+        </w:tc>
+        <w:tc>
+          <w:tcPr>
+            <w:tcW w:w="3960" w:type="dxa"/>
+          </w:tcPr>
+          <w:p>
+            <w:pPr>
+              <w:spacing w:line="360" w:lineRule="auto"/>
+            </w:pPr>
+            <w:r>
+              <w:t>Verification attempt time</w:t>
+            </w:r>
+          </w:p>
+        </w:tc>
+      </w:tr>
+      <w:tr>
+        <w:trPr>
+          <w:jc w:val="center"/>
+        </w:trPr>
+        <w:tc>
+          <w:tcPr>
+            <w:tcW w:w="1525" w:type="dxa"/>
+          </w:tcPr>
+          <w:p>
+            <w:pPr>
+              <w:spacing w:line="360" w:lineRule="auto"/>
+            </w:pPr>
+            <w:r>
+              <w:t>Result</w:t>
+            </w:r>
+          </w:p>
+        </w:tc>
+        <w:tc>
+          <w:tcPr>
+            <w:tcW w:w="1440" w:type="dxa"/>
+          </w:tcPr>
+          <w:p>
+            <w:pPr>
+              <w:spacing w:line="360" w:lineRule="auto"/>
+            </w:pPr>
+            <w:r>
+              <w:t>TinyInt(1)</w:t>
+            </w:r>
+          </w:p>
+        </w:tc>
+        <w:tc>
+          <w:tcPr>
+            <w:tcW w:w="3960" w:type="dxa"/>
+          </w:tcPr>
+          <w:p>
+            <w:pPr>
+              <w:spacing w:line="360" w:lineRule="auto"/>
+            </w:pPr>
+            <w:r>
+              <w:t>Boolean pass/fail result</w:t>
+            </w:r>
+          </w:p>
+        </w:tc>
+      </w:tr>
+      <w:tr>
+        <w:trPr>
+          <w:jc w:val="center"/>
+        </w:trPr>
+        <w:tc>
+          <w:tcPr>
+            <w:tcW w:w="1525" w:type="dxa"/>
+          </w:tcPr>
+          <w:p>
+            <w:pPr>
+              <w:spacing w:line="360" w:lineRule="auto"/>
+            </w:pPr>
+            <w:r>
+              <w:t>Method</w:t>
+            </w:r>
+          </w:p>
+        </w:tc>
+        <w:tc>
+          <w:tcPr>
+            <w:tcW w:w="1440" w:type="dxa"/>
+          </w:tcPr>
+          <w:p>
+            <w:pPr>
+              <w:spacing w:line="360" w:lineRule="auto"/>
+            </w:pPr>
+            <w:r>
+              <w:t>Text</w:t>
+            </w:r>
+          </w:p>
+        </w:tc>
+        <w:tc>
+          <w:tcPr>
+            <w:tcW w:w="3960" w:type="dxa"/>
+          </w:tcPr>
+          <w:p>
+            <w:pPr>
+              <w:spacing w:line="360" w:lineRule="auto"/>
+            </w:pPr>
+            <w:r>
+              <w:t>Method used (Ex: Photo + ID)</w:t>
+            </w:r>
+          </w:p>
+        </w:tc>
+      </w:tr>
+      <w:tr>
+        <w:trPr>
+          <w:jc w:val="center"/>
+        </w:trPr>
+        <w:tc>
+          <w:tcPr>
+            <w:tcW w:w="1525" w:type="dxa"/>
+          </w:tcPr>
+          <w:p>
+            <w:pPr>
+              <w:spacing w:line="360" w:lineRule="auto"/>
+            </w:pPr>
+            <w:r>
+              <w:t>Policy</w:t>
+            </w:r>
+          </w:p>
+        </w:tc>
+        <w:tc>
+          <w:tcPr>
+            <w:tcW w:w="1440" w:type="dxa"/>
+          </w:tcPr>
+          <w:p>
+            <w:pPr>
+              <w:spacing w:line="360" w:lineRule="auto"/>
+            </w:pPr>
+            <w:r>
+              <w:t>Text</w:t>
+            </w:r>
+          </w:p>
+        </w:tc>
+        <w:tc>
+          <w:tcPr>
+            <w:tcW w:w="3960" w:type="dxa"/>
+          </w:tcPr>
+          <w:p>
+            <w:pPr>
+              <w:spacing w:line="360" w:lineRule="auto"/>
+            </w:pPr>
+            <w:r>
+              <w:t>Policy Applied (Ex: NY State ID)</w:t>
+            </w:r>
+          </w:p>
+        </w:tc>
+      </w:tr>
+      <w:tr>
+        <w:trPr>
+          <w:jc w:val="center"/>
+        </w:trPr>
+        <w:tc>
+          <w:tcPr>
+            <w:tcW w:w="1525" w:type="dxa"/>
+          </w:tcPr>
+          <w:p>
+            <w:pPr>
+              <w:spacing w:line="360" w:lineRule="auto"/>
+            </w:pPr>
+            <w:r>
+              <w:lastRenderedPageBreak/>
+              <w:t>Confidence</w:t>
+            </w:r>
+          </w:p>
+        </w:tc>
+        <w:tc>
+          <w:tcPr>
+            <w:tcW w:w="1440" w:type="dxa"/>
+          </w:tcPr>
+          <w:p>
+            <w:pPr>
+              <w:spacing w:line="360" w:lineRule="auto"/>
+            </w:pPr>
+            <w:r>
+              <w:t>Int</w:t>
+            </w:r>
+          </w:p>
+        </w:tc>
+        <w:tc>
+          <w:tcPr>
+            <w:tcW w:w="3960" w:type="dxa"/>
+          </w:tcPr>
+          <w:p>
+            <w:pPr>
+              <w:spacing w:line="360" w:lineRule="auto"/>
+            </w:pPr>
+            <w:r>
+              <w:t>Confidence Score</w:t>
+            </w:r>
+          </w:p>
+        </w:tc>
+      </w:tr>
+      <w:tr>
+        <w:trPr>
+          <w:jc w:val="center"/>
+        </w:trPr>
+        <w:tc>
+          <w:tcPr>
+            <w:tcW w:w="1525" w:type="dxa"/>
+          </w:tcPr>
+          <w:p>
+            <w:pPr>
+              <w:spacing w:line="360" w:lineRule="auto"/>
+            </w:pPr>
+            <w:r>
+              <w:t>Error_Code</w:t>
+            </w:r>
+          </w:p>
+        </w:tc>
+        <w:tc>
+          <w:tcPr>
+            <w:tcW w:w="1440" w:type="dxa"/>
+          </w:tcPr>
+          <w:p>
+            <w:pPr>
+              <w:spacing w:line="360" w:lineRule="auto"/>
+            </w:pPr>
+            <w:r>
+              <w:t>Text</w:t>
+            </w:r>
+          </w:p>
+        </w:tc>
+        <w:tc>
+          <w:tcPr>
+            <w:tcW w:w="3960" w:type="dxa"/>
+          </w:tcPr>
+          <w:p>
+            <w:pPr>
+              <w:spacing w:line="360" w:lineRule="auto"/>
+            </w:pPr>
+            <w:r>
+              <w:t>Error if Failed</w:t>
+            </w:r>
+          </w:p>
+        </w:tc>
+      </w:tr>
+      <w:tr>
+        <w:trPr>
+          <w:jc w:val="center"/>
+        </w:trPr>
+        <w:tc>
+          <w:tcPr>
+            <w:tcW w:w="1525" w:type="dxa"/>
+          </w:tcPr>
+          <w:p>
+            <w:pPr>
+              <w:spacing w:line="360" w:lineRule="auto"/>
+            </w:pPr>
+            <w:r>
+              <w:t>Token</w:t>
+            </w:r>
+          </w:p>
+        </w:tc>
+        <w:tc>
+          <w:tcPr>
+            <w:tcW w:w="1440" w:type="dxa"/>
+          </w:tcPr>
+          <w:p>
+            <w:pPr>
+              <w:spacing w:line="360" w:lineRule="auto"/>
+            </w:pPr>
+            <w:r>
+              <w:t>Text</w:t>
+            </w:r>
+          </w:p>
+        </w:tc>
+        <w:tc>
+          <w:tcPr>
+            <w:tcW w:w="3960" w:type="dxa"/>
+          </w:tcPr>
+          <w:p>
+            <w:pPr>
+              <w:spacing w:line="360" w:lineRule="auto"/>
+            </w:pPr>
+            <w:r>
+              <w:t>OAuth Token</w:t>
+            </w:r>
+          </w:p>
+        </w:tc>
+      </w:tr>
+      <w:tr>
+        <w:trPr>
+          <w:jc w:val="center"/>
+        </w:trPr>
+        <w:tc>
+          <w:tcPr>
+            <w:tcW w:w="1525" w:type="dxa"/>
+          </w:tcPr>
+          <w:p>
+            <w:pPr>
+              <w:spacing w:line="360" w:lineRule="auto"/>
+            </w:pPr>
+            <w:r>
+              <w:t>Expire_At</w:t>
+            </w:r>
+          </w:p>
+        </w:tc>
+        <w:tc>
+          <w:tcPr>
+            <w:tcW w:w="1440" w:type="dxa"/>
+          </w:tcPr>
+          <w:p>
+            <w:pPr>
+              <w:spacing w:line="360" w:lineRule="auto"/>
+            </w:pPr>
+            <w:r>
+              <w:t>Timestamp</w:t>
+            </w:r>
+          </w:p>
+        </w:tc>
+        <w:tc>
+          <w:tcPr>
+            <w:tcW w:w="3960" w:type="dxa"/>
+          </w:tcPr>
+          <w:p>
+            <w:pPr>
+              <w:spacing w:line="360" w:lineRule="auto"/>
+            </w:pPr>
+            <w:r>
+              <w:t>Token Expiration Time</w:t>
+            </w:r>
+          </w:p>
+        </w:tc>
+      </w:tr>
+    </w:tbl>
+    <w:p>
+      <w:pPr>
+        <w:spacing w:line="360" w:lineRule="auto"/>
+      </w:pPr>
+    </w:p>
+    <w:p>
+      <w:pPr>
+        <w:spacing w:line="360" w:lineRule="auto"/>
+        <w:jc w:val="center"/>
+        <w:rPr>
+          <w:b/>
+          <w:sz w:val="28"/>
+        </w:rPr>
+      </w:pPr>
       <w:r>
-        <w:t>s to match the following order:</w:t>
+        <w:rPr>
+          <w:b/>
+          <w:sz w:val="28"/>
+        </w:rPr>
+        <w:t>Company X</w:t>
       </w:r>
     </w:p>
     <w:p>
       <w:pPr>
-        <w:spacing w:line="240" w:lineRule="auto"/>
+        <w:spacing w:line="360" w:lineRule="auto"/>
       </w:pPr>
       <w:r>
-        <w:t>Order: (Resu</w:t>
+        <w:t xml:space="preserve">Dummy company table representing </w:t>
       </w:r>
       <w:r>
-        <w:t>lt, Method, Policy, Confidence)</w:t>
+        <w:t xml:space="preserve">a user logging into </w:t>
       </w:r>
-      <w:bookmarkStart w:id="0" w:name="_GoBack"/>
-      <w:bookmarkEnd w:id="0"/>
+      <w:r>
+        <w:t>EasyVerify</w:t>
+      </w:r>
+      <w:r>
+        <w:t xml:space="preserve"> through another company to verify ID</w:t>
+      </w:r>
+      <w:r>
+        <w:t>.</w:t>
+      </w:r>
+    </w:p>
+    <w:tbl>
+      <w:tblPr>
+        <w:tblStyle w:val="TableGrid"/>
+        <w:tblW w:w="0" w:type="auto"/>
+        <w:jc w:val="center"/>
+        <w:tblLook w:val="04A0" w:firstRow="1" w:lastRow="0" w:firstColumn="1" w:lastColumn="0" w:noHBand="0" w:noVBand="1"/>
+      </w:tblPr>
+      <w:tblGrid>
+        <w:gridCol w:w="2337"/>
+        <w:gridCol w:w="2337"/>
+        <w:gridCol w:w="2338"/>
+      </w:tblGrid>
+      <w:tr>
+        <w:trPr>
+          <w:jc w:val="center"/>
+        </w:trPr>
+        <w:tc>
+          <w:tcPr>
+            <w:tcW w:w="2337" w:type="dxa"/>
+          </w:tcPr>
+          <w:p>
+            <w:pPr>
+              <w:spacing w:line="360" w:lineRule="auto"/>
+              <w:jc w:val="center"/>
+            </w:pPr>
+            <w:r>
+              <w:t>Column</w:t>
+            </w:r>
+          </w:p>
+        </w:tc>
+        <w:tc>
+          <w:tcPr>
+            <w:tcW w:w="2337" w:type="dxa"/>
+          </w:tcPr>
+          <w:p>
+            <w:pPr>
+              <w:spacing w:line="360" w:lineRule="auto"/>
+              <w:jc w:val="center"/>
+            </w:pPr>
+            <w:r>
+              <w:t>Type</w:t>
+            </w:r>
+          </w:p>
+        </w:tc>
+        <w:tc>
+          <w:tcPr>
+            <w:tcW w:w="2338" w:type="dxa"/>
+          </w:tcPr>
+          <w:p>
+            <w:pPr>
+              <w:spacing w:line="360" w:lineRule="auto"/>
+              <w:jc w:val="center"/>
+            </w:pPr>
+            <w:r>
+              <w:t>Description</w:t>
+            </w:r>
+          </w:p>
+        </w:tc>
+      </w:tr>
+      <w:tr>
+        <w:trPr>
+          <w:jc w:val="center"/>
+        </w:trPr>
+        <w:tc>
+          <w:tcPr>
+            <w:tcW w:w="2337" w:type="dxa"/>
+          </w:tcPr>
+          <w:p>
+            <w:pPr>
+              <w:spacing w:line="360" w:lineRule="auto"/>
+              <w:jc w:val="center"/>
+            </w:pPr>
+            <w:r>
+              <w:t>ID</w:t>
+            </w:r>
+          </w:p>
+        </w:tc>
+        <w:tc>
+          <w:tcPr>
+            <w:tcW w:w="2337" w:type="dxa"/>
+          </w:tcPr>
+          <w:p>
+            <w:pPr>
+              <w:spacing w:line="360" w:lineRule="auto"/>
+              <w:jc w:val="center"/>
+            </w:pPr>
+            <w:r>
+              <w:t>Int(11)</w:t>
+            </w:r>
+          </w:p>
+        </w:tc>
+        <w:tc>
+          <w:tcPr>
+            <w:tcW w:w="2338" w:type="dxa"/>
+          </w:tcPr>
+          <w:p>
+            <w:pPr>
+              <w:spacing w:line="360" w:lineRule="auto"/>
+              <w:jc w:val="center"/>
+            </w:pPr>
+            <w:r>
+              <w:t>(PK) Companies ID for User</w:t>
+            </w:r>
+          </w:p>
+        </w:tc>
+      </w:tr>
+      <w:tr>
+        <w:trPr>
+          <w:jc w:val="center"/>
+        </w:trPr>
+        <w:tc>
+          <w:tcPr>
+            <w:tcW w:w="2337" w:type="dxa"/>
+          </w:tcPr>
+          <w:p>
+            <w:pPr>
+              <w:spacing w:line="360" w:lineRule="auto"/>
+              <w:jc w:val="center"/>
+            </w:pPr>
+            <w:r>
+              <w:t>User_ID</w:t>
+            </w:r>
+          </w:p>
+        </w:tc>
+        <w:tc>
+          <w:tcPr>
+            <w:tcW w:w="2337" w:type="dxa"/>
+          </w:tcPr>
+          <w:p>
+            <w:pPr>
+              <w:spacing w:line="360" w:lineRule="auto"/>
+              <w:jc w:val="center"/>
+            </w:pPr>
+            <w:r>
+              <w:t>Int(11)</w:t>
+            </w:r>
+          </w:p>
+        </w:tc>
+        <w:tc>
+          <w:tcPr>
+            <w:tcW w:w="2338" w:type="dxa"/>
+          </w:tcPr>
+          <w:p>
+            <w:pPr>
+              <w:spacing w:line="360" w:lineRule="auto"/>
+              <w:jc w:val="center"/>
+            </w:pPr>
+            <w:r>
+              <w:t>EV’s ID for user</w:t>
+            </w:r>
+          </w:p>
+        </w:tc>
+      </w:tr>
+      <w:tr>
+        <w:trPr>
+          <w:jc w:val="center"/>
+        </w:trPr>
+        <w:tc>
+          <w:tcPr>
+            <w:tcW w:w="2337" w:type="dxa"/>
+          </w:tcPr>
+          <w:p>
+            <w:pPr>
+              <w:spacing w:line="360" w:lineRule="auto"/>
+              <w:jc w:val="center"/>
+            </w:pPr>
+            <w:r>
+              <w:t>Name</w:t>
+            </w:r>
+          </w:p>
+        </w:tc>
+        <w:tc>
+          <w:tcPr>
+            <w:tcW w:w="2337" w:type="dxa"/>
+          </w:tcPr>
+          <w:p>
+            <w:pPr>
+              <w:spacing w:line="360" w:lineRule="auto"/>
+              <w:jc w:val="center"/>
+            </w:pPr>
+            <w:r>
+              <w:t>VarChar</w:t>
+            </w:r>
+          </w:p>
+        </w:tc>
+        <w:tc>
+          <w:tcPr>
+            <w:tcW w:w="2338" w:type="dxa"/>
+          </w:tcPr>
+          <w:p>
+            <w:pPr>
+              <w:spacing w:line="360" w:lineRule="auto"/>
+              <w:jc w:val="center"/>
+            </w:pPr>
+            <w:r>
+              <w:t>Users</w:t>
+            </w:r>
+            <w:r>
+              <w:t xml:space="preserve"> </w:t>
+            </w:r>
+            <w:r>
+              <w:t>Name</w:t>
+            </w:r>
+          </w:p>
+        </w:tc>
+      </w:tr>
+      <w:tr>
+        <w:trPr>
+          <w:jc w:val="center"/>
+        </w:trPr>
+        <w:tc>
+          <w:tcPr>
+            <w:tcW w:w="2337" w:type="dxa"/>
+          </w:tcPr>
+          <w:p>
+            <w:pPr>
+              <w:spacing w:line="360" w:lineRule="auto"/>
+              <w:jc w:val="center"/>
+            </w:pPr>
+            <w:r>
+              <w:t>Email</w:t>
+            </w:r>
+          </w:p>
+        </w:tc>
+        <w:tc>
+          <w:tcPr>
+            <w:tcW w:w="2337" w:type="dxa"/>
+          </w:tcPr>
+          <w:p>
+            <w:pPr>
+              <w:spacing w:line="360" w:lineRule="auto"/>
+              <w:jc w:val="center"/>
+            </w:pPr>
+            <w:r>
+              <w:t>VarChar</w:t>
+            </w:r>
+          </w:p>
+        </w:tc>
+        <w:tc>
+          <w:tcPr>
+            <w:tcW w:w="2338" w:type="dxa"/>
+          </w:tcPr>
+          <w:p>
+            <w:pPr>
+              <w:spacing w:line="360" w:lineRule="auto"/>
+              <w:jc w:val="center"/>
+            </w:pPr>
+            <w:r>
+              <w:t>(FK)Links to users.email</w:t>
+            </w:r>
+          </w:p>
+        </w:tc>
+      </w:tr>
+      <w:tr>
+        <w:trPr>
+          <w:jc w:val="center"/>
+        </w:trPr>
+        <w:tc>
+          <w:tcPr>
+            <w:tcW w:w="2337" w:type="dxa"/>
+          </w:tcPr>
+          <w:p>
+            <w:pPr>
+              <w:spacing w:line="360" w:lineRule="auto"/>
+              <w:jc w:val="center"/>
+            </w:pPr>
+            <w:r>
+              <w:t>Pw</w:t>
+            </w:r>
+          </w:p>
+        </w:tc>
+        <w:tc>
+          <w:tcPr>
+            <w:tcW w:w="2337" w:type="dxa"/>
+          </w:tcPr>
+          <w:p>
+            <w:pPr>
+              <w:spacing w:line="360" w:lineRule="auto"/>
+              <w:jc w:val="center"/>
+            </w:pPr>
+            <w:r>
+              <w:t>Char(100)</w:t>
+            </w:r>
+          </w:p>
+        </w:tc>
+        <w:tc>
+          <w:tcPr>
+            <w:tcW w:w="2338" w:type="dxa"/>
+          </w:tcPr>
+          <w:p>
+            <w:pPr>
+              <w:spacing w:line="360" w:lineRule="auto"/>
+              <w:jc w:val="center"/>
+            </w:pPr>
+            <w:r>
+              <w:t>Hashed password</w:t>
+            </w:r>
+          </w:p>
+        </w:tc>
+      </w:tr>
+      <w:tr>
+        <w:trPr>
+          <w:jc w:val="center"/>
+        </w:trPr>
+        <w:tc>
+          <w:tcPr>
+            <w:tcW w:w="2337" w:type="dxa"/>
+          </w:tcPr>
+          <w:p>
+            <w:pPr>
+              <w:spacing w:line="360" w:lineRule="auto"/>
+              <w:jc w:val="center"/>
+            </w:pPr>
+            <w:r>
+              <w:br/>
+              <w:t>Verified</w:t>
+            </w:r>
+          </w:p>
+        </w:tc>
+        <w:tc>
+          <w:tcPr>
+            <w:tcW w:w="2337" w:type="dxa"/>
+          </w:tcPr>
+          <w:p>
+            <w:pPr>
+              <w:tabs>
+                <w:tab w:val="left" w:pos="480"/>
+                <w:tab w:val="center" w:pos="1060"/>
+              </w:tabs>
+              <w:spacing w:line="360" w:lineRule="auto"/>
+              <w:jc w:val="center"/>
+            </w:pPr>
+            <w:r>
+              <w:br/>
+              <w:t>TinyInt</w:t>
+            </w:r>
+          </w:p>
+        </w:tc>
+        <w:tc>
+          <w:tcPr>
+            <w:tcW w:w="2338" w:type="dxa"/>
+          </w:tcPr>
+          <w:p>
+            <w:pPr>
+              <w:spacing w:line="360" w:lineRule="auto"/>
+              <w:jc w:val="center"/>
+            </w:pPr>
+            <w:r>
+              <w:t>Boolean for user being pre-verified or not</w:t>
+            </w:r>
+          </w:p>
+        </w:tc>
+      </w:tr>
+    </w:tbl>
+    <w:p>
+      <w:pPr>
+        <w:spacing w:line="360" w:lineRule="auto"/>
+      </w:pPr>
     </w:p>
     <w:p>
       <w:pPr>
-        <w:spacing w:line="240" w:lineRule="auto"/>
+        <w:spacing w:line="360" w:lineRule="auto"/>
+        <w:jc w:val="center"/>
+        <w:rPr>
+          <w:b/>
+          <w:sz w:val="32"/>
+        </w:rPr>
       </w:pPr>
       <w:r>
-        <w:t>Example Python Line:</w:t>
+        <w:rPr>
+          <w:b/>
+          <w:sz w:val="32"/>
+        </w:rPr>
+        <w:t>Stored Procedures</w:t>
       </w:r>
     </w:p>
+    <w:tbl>
+      <w:tblPr>
+        <w:tblStyle w:val="TableGrid"/>
+        <w:tblW w:w="0" w:type="auto"/>
+        <w:jc w:val="center"/>
+        <w:tblLook w:val="04A0" w:firstRow="1" w:lastRow="0" w:firstColumn="1" w:lastColumn="0" w:noHBand="0" w:noVBand="1"/>
+      </w:tblPr>
+      <w:tblGrid>
+        <w:gridCol w:w="2762"/>
+        <w:gridCol w:w="2070"/>
+      </w:tblGrid>
+      <w:tr>
+        <w:trPr>
+          <w:jc w:val="center"/>
+        </w:trPr>
+        <w:tc>
+          <w:tcPr>
+            <w:tcW w:w="2245" w:type="dxa"/>
+          </w:tcPr>
+          <w:p>
+            <w:pPr>
+              <w:spacing w:line="360" w:lineRule="auto"/>
+              <w:jc w:val="center"/>
+            </w:pPr>
+            <w:r>
+              <w:t>Procedure</w:t>
+            </w:r>
+          </w:p>
+        </w:tc>
+        <w:tc>
+          <w:tcPr>
+            <w:tcW w:w="2070" w:type="dxa"/>
+          </w:tcPr>
+          <w:p>
+            <w:pPr>
+              <w:spacing w:line="360" w:lineRule="auto"/>
+              <w:jc w:val="center"/>
+            </w:pPr>
+            <w:r>
+              <w:t>Description</w:t>
+            </w:r>
+          </w:p>
+        </w:tc>
+      </w:tr>
+      <w:tr>
+        <w:trPr>
+          <w:jc w:val="center"/>
+        </w:trPr>
+        <w:tc>
+          <w:tcPr>
+            <w:tcW w:w="2245" w:type="dxa"/>
+          </w:tcPr>
+          <w:p>
+            <w:pPr>
+              <w:spacing w:line="360" w:lineRule="auto"/>
+              <w:jc w:val="center"/>
+            </w:pPr>
+            <w:r>
+              <w:t>Insert_user</w:t>
+            </w:r>
+          </w:p>
+        </w:tc>
+        <w:tc>
+          <w:tcPr>
+            <w:tcW w:w="2070" w:type="dxa"/>
+          </w:tcPr>
+          <w:p>
+            <w:pPr>
+              <w:spacing w:line="360" w:lineRule="auto"/>
+              <w:jc w:val="center"/>
+            </w:pPr>
+            <w:r>
+              <w:t>Add user</w:t>
+            </w:r>
+          </w:p>
+        </w:tc>
+      </w:tr>
+      <w:tr>
+        <w:trPr>
+          <w:jc w:val="center"/>
+        </w:trPr>
+        <w:tc>
+          <w:tcPr>
+            <w:tcW w:w="2245" w:type="dxa"/>
+          </w:tcPr>
+          <w:p>
+            <w:pPr>
+              <w:spacing w:line="360" w:lineRule="auto"/>
+              <w:jc w:val="center"/>
+            </w:pPr>
+            <w:r>
+              <w:t>Get_user</w:t>
+            </w:r>
+          </w:p>
+        </w:tc>
+        <w:tc>
+          <w:tcPr>
+            <w:tcW w:w="2070" w:type="dxa"/>
+          </w:tcPr>
+          <w:p>
+            <w:pPr>
+              <w:spacing w:line="360" w:lineRule="auto"/>
+              <w:jc w:val="center"/>
+            </w:pPr>
+            <w:r>
+              <w:t>Retrieve user</w:t>
+            </w:r>
+          </w:p>
+        </w:tc>
+      </w:tr>
+      <w:tr>
+        <w:trPr>
+          <w:jc w:val="center"/>
+        </w:trPr>
+        <w:tc>
+          <w:tcPr>
+            <w:tcW w:w="2245" w:type="dxa"/>
+          </w:tcPr>
+          <w:p>
+            <w:pPr>
+              <w:spacing w:line="360" w:lineRule="auto"/>
+              <w:jc w:val="center"/>
+            </w:pPr>
+            <w:r>
+              <w:t>Delete_user</w:t>
+            </w:r>
+          </w:p>
+        </w:tc>
+        <w:tc>
+          <w:tcPr>
+            <w:tcW w:w="2070" w:type="dxa"/>
+          </w:tcPr>
+          <w:p>
+            <w:pPr>
+              <w:spacing w:line="360" w:lineRule="auto"/>
+              <w:jc w:val="center"/>
+            </w:pPr>
+            <w:r>
+              <w:t>Remove user</w:t>
+            </w:r>
+          </w:p>
+        </w:tc>
+      </w:tr>
+      <w:tr>
+        <w:trPr>
+          <w:jc w:val="center"/>
+        </w:trPr>
+        <w:tc>
+          <w:tcPr>
+            <w:tcW w:w="2245" w:type="dxa"/>
+          </w:tcPr>
+          <w:p>
+            <w:pPr>
+              <w:spacing w:line="360" w:lineRule="auto"/>
+              <w:jc w:val="center"/>
+            </w:pPr>
+            <w:r>
+              <w:t>Update_last_login</w:t>
+            </w:r>
+          </w:p>
+        </w:tc>
+        <w:tc>
+          <w:tcPr>
+            <w:tcW w:w="2070" w:type="dxa"/>
+          </w:tcPr>
+          <w:p>
+            <w:pPr>
+              <w:spacing w:line="360" w:lineRule="auto"/>
+              <w:jc w:val="center"/>
+            </w:pPr>
+            <w:r>
+              <w:t>Update last login timestamp</w:t>
+            </w:r>
+          </w:p>
+        </w:tc>
+      </w:tr>
+      <w:tr>
+        <w:trPr>
+          <w:jc w:val="center"/>
+        </w:trPr>
+        <w:tc>
+          <w:tcPr>
+            <w:tcW w:w="2245" w:type="dxa"/>
+          </w:tcPr>
+          <w:p>
+            <w:pPr>
+              <w:spacing w:line="360" w:lineRule="auto"/>
+              <w:jc w:val="center"/>
+            </w:pPr>
+            <w:r>
+              <w:lastRenderedPageBreak/>
+              <w:t>Insert_verification</w:t>
+            </w:r>
+          </w:p>
+        </w:tc>
+        <w:tc>
+          <w:tcPr>
+            <w:tcW w:w="2070" w:type="dxa"/>
+          </w:tcPr>
+          <w:p>
+            <w:pPr>
+              <w:spacing w:line="360" w:lineRule="auto"/>
+              <w:jc w:val="center"/>
+            </w:pPr>
+            <w:r>
+              <w:t>Log verification attempt</w:t>
+            </w:r>
+          </w:p>
+        </w:tc>
+      </w:tr>
+      <w:tr>
+        <w:trPr>
+          <w:jc w:val="center"/>
+        </w:trPr>
+        <w:tc>
+          <w:tcPr>
+            <w:tcW w:w="2245" w:type="dxa"/>
+          </w:tcPr>
+          <w:p>
+            <w:pPr>
+              <w:spacing w:line="360" w:lineRule="auto"/>
+            </w:pPr>
+            <w:r>
+              <w:t>Get_verifications_by_user</w:t>
+            </w:r>
+          </w:p>
+        </w:tc>
+        <w:tc>
+          <w:tcPr>
+            <w:tcW w:w="2070" w:type="dxa"/>
+          </w:tcPr>
+          <w:p>
+            <w:pPr>
+              <w:spacing w:line="360" w:lineRule="auto"/>
+            </w:pPr>
+            <w:r>
+              <w:t>Retrieve all verifications from a user</w:t>
+            </w:r>
+          </w:p>
+        </w:tc>
+      </w:tr>
+      <w:tr>
+        <w:trPr>
+          <w:jc w:val="center"/>
+        </w:trPr>
+        <w:tc>
+          <w:tcPr>
+            <w:tcW w:w="2245" w:type="dxa"/>
+          </w:tcPr>
+          <w:p>
+            <w:pPr>
+              <w:spacing w:line="360" w:lineRule="auto"/>
+            </w:pPr>
+            <w:r>
+              <w:t>Check_token</w:t>
+            </w:r>
+          </w:p>
+        </w:tc>
+        <w:tc>
+          <w:tcPr>
+            <w:tcW w:w="2070" w:type="dxa"/>
+          </w:tcPr>
+          <w:p>
+            <w:pPr>
+              <w:spacing w:line="360" w:lineRule="auto"/>
+            </w:pPr>
+            <w:r>
+              <w:t>Check status of OAuth token</w:t>
+            </w:r>
+          </w:p>
+        </w:tc>
+      </w:tr>
+      <w:tr>
+        <w:trPr>
+          <w:jc w:val="center"/>
+        </w:trPr>
+        <w:tc>
+          <w:tcPr>
+            <w:tcW w:w="2245" w:type="dxa"/>
+          </w:tcPr>
+          <w:p>
+            <w:pPr>
+              <w:spacing w:line="360" w:lineRule="auto"/>
+            </w:pPr>
+            <w:r>
+              <w:t>Delete</w:t>
+            </w:r>
+            <w:bookmarkStart w:id="0" w:name="_GoBack"/>
+            <w:bookmarkEnd w:id="0"/>
+            <w:r>
+              <w:t>_expired_tokens</w:t>
+            </w:r>
+          </w:p>
+        </w:tc>
+        <w:tc>
+          <w:tcPr>
+            <w:tcW w:w="2070" w:type="dxa"/>
+          </w:tcPr>
+          <w:p>
+            <w:pPr>
+              <w:spacing w:line="360" w:lineRule="auto"/>
+            </w:pPr>
+            <w:r>
+              <w:t>Removes expired tokens</w:t>
+            </w:r>
+          </w:p>
+        </w:tc>
+      </w:tr>
+      <w:tr>
+        <w:trPr>
+          <w:jc w:val="center"/>
+        </w:trPr>
+        <w:tc>
+          <w:tcPr>
+            <w:tcW w:w="2245" w:type="dxa"/>
+          </w:tcPr>
+          <w:p>
+            <w:pPr>
+              <w:spacing w:line="360" w:lineRule="auto"/>
+            </w:pPr>
+            <w:r>
+              <w:t>Insert_company</w:t>
+            </w:r>
+          </w:p>
+        </w:tc>
+        <w:tc>
+          <w:tcPr>
+            <w:tcW w:w="2070" w:type="dxa"/>
+          </w:tcPr>
+          <w:p>
+            <w:pPr>
+              <w:spacing w:line="360" w:lineRule="auto"/>
+            </w:pPr>
+            <w:r>
+              <w:t>Add a new user to company</w:t>
+            </w:r>
+          </w:p>
+        </w:tc>
+      </w:tr>
+      <w:tr>
+        <w:trPr>
+          <w:jc w:val="center"/>
+        </w:trPr>
+        <w:tc>
+          <w:tcPr>
+            <w:tcW w:w="2245" w:type="dxa"/>
+          </w:tcPr>
+          <w:p>
+            <w:pPr>
+              <w:spacing w:line="360" w:lineRule="auto"/>
+            </w:pPr>
+            <w:r>
+              <w:t>Get_company</w:t>
+            </w:r>
+          </w:p>
+        </w:tc>
+        <w:tc>
+          <w:tcPr>
+            <w:tcW w:w="2070" w:type="dxa"/>
+          </w:tcPr>
+          <w:p>
+            <w:pPr>
+              <w:spacing w:line="360" w:lineRule="auto"/>
+            </w:pPr>
+            <w:r>
+              <w:t>Retrieve user from company via email</w:t>
+            </w:r>
+          </w:p>
+        </w:tc>
+      </w:tr>
+      <w:tr>
+        <w:trPr>
+          <w:jc w:val="center"/>
+        </w:trPr>
+        <w:tc>
+          <w:tcPr>
+            <w:tcW w:w="2245" w:type="dxa"/>
+          </w:tcPr>
+          <w:p>
+            <w:pPr>
+              <w:spacing w:line="360" w:lineRule="auto"/>
+            </w:pPr>
+            <w:r>
+              <w:t>Update_company</w:t>
+            </w:r>
+          </w:p>
+        </w:tc>
+        <w:tc>
+          <w:tcPr>
+            <w:tcW w:w="2070" w:type="dxa"/>
+          </w:tcPr>
+          <w:p>
+            <w:pPr>
+              <w:spacing w:line="360" w:lineRule="auto"/>
+            </w:pPr>
+            <w:r>
+              <w:t>Update info on company table</w:t>
+            </w:r>
+          </w:p>
+        </w:tc>
+      </w:tr>
+      <w:tr>
+        <w:trPr>
+          <w:jc w:val="center"/>
+        </w:trPr>
+        <w:tc>
+          <w:tcPr>
+            <w:tcW w:w="2245" w:type="dxa"/>
+          </w:tcPr>
+          <w:p>
+            <w:pPr>
+              <w:spacing w:line="360" w:lineRule="auto"/>
+            </w:pPr>
+            <w:r>
+              <w:t>Delete_company</w:t>
+            </w:r>
+          </w:p>
+        </w:tc>
+        <w:tc>
+          <w:tcPr>
+            <w:tcW w:w="2070" w:type="dxa"/>
+          </w:tcPr>
+          <w:p>
+            <w:pPr>
+              <w:spacing w:line="360" w:lineRule="auto"/>
+            </w:pPr>
+            <w:r>
+              <w:t>Delete user from company table</w:t>
+            </w:r>
+          </w:p>
+        </w:tc>
+      </w:tr>
+    </w:tbl>
     <w:p>
       <w:pPr>
-        <w:spacing w:line="240" w:lineRule="auto"/>
+        <w:spacing w:line="360" w:lineRule="auto"/>
       </w:pPr>
-      <w:r>
-        <w:t>new_record = (1, "</w:t>
-      </w:r>
-      <w:proofErr w:type="spellStart"/>
-      <w:r>
-        <w:t>face_scan</w:t>
-      </w:r>
-      <w:proofErr w:type="spellEnd"/>
-      <w:r>
-        <w:t>", "strict_v1", 95)</w:t>
-      </w:r>
     </w:p>
     <w:sectPr>
       <w:pgSz w:w="12240" w:h="15840"/>
@@ -654,6 +2262,25 @@
     <w:semiHidden/>
     <w:unhideWhenUsed/>
   </w:style>
+  <w:style w:type="table" w:styleId="TableGrid">
+    <w:name w:val="Table Grid"/>
+    <w:basedOn w:val="TableNormal"/>
+    <w:uiPriority w:val="39"/>
+    <w:rsid w:val="00146EA6"/>
+    <w:pPr>
+      <w:spacing w:after="0" w:line="240" w:lineRule="auto"/>
+    </w:pPr>
+    <w:tblPr>
+      <w:tblBorders>
+        <w:top w:val="single" w:sz="4" w:space="0" w:color="auto"/>
+        <w:left w:val="single" w:sz="4" w:space="0" w:color="auto"/>
+        <w:bottom w:val="single" w:sz="4" w:space="0" w:color="auto"/>
+        <w:right w:val="single" w:sz="4" w:space="0" w:color="auto"/>
+        <w:insideH w:val="single" w:sz="4" w:space="0" w:color="auto"/>
+        <w:insideV w:val="single" w:sz="4" w:space="0" w:color="auto"/>
+      </w:tblBorders>
+    </w:tblPr>
+  </w:style>
 </w:styles>
 </file>
 

</xml_diff>